<commit_message>
Blindaje epistemologico: enmarcar hallazgos como verificaciones funcionales, hipotesis de diseno y observaciones exploratorias
</commit_message>
<xml_diff>
--- a/publicacion/manuscrito_difusiones/articulo_tecnico_sin_participantes.docx
+++ b/publicacion/manuscrito_difusiones/articulo_tecnico_sin_participantes.docx
@@ -1419,7 +1419,7 @@
           <w:rFonts w:ascii="Times New Roman" w:hAnsi="Times New Roman"/>
           <w:sz w:val="24"/>
         </w:rPr>
-        <w:t>En respuesta a la primera pregunta de investigación, la implementación permitió operacionalizar la separación entre las reglas pedagógicas almacenadas en archivos de especificación y la capacidad generativa del modelo.</w:t>
+        <w:t>En respuesta a la primera pregunta de investigación, las pruebas de verificación funcional demostraron la viabilidad técnica de operacionalizar la separación entre las reglas pedagógicas almacenadas en archivos de especificación y la capacidad generativa del modelo.</w:t>
       </w:r>
     </w:p>
     <w:p>
@@ -1446,7 +1446,7 @@
           <w:rFonts w:ascii="Times New Roman" w:hAnsi="Times New Roman"/>
           <w:sz w:val="24"/>
         </w:rPr>
-        <w:t xml:space="preserve"> y generando borradores de devolución que citaban números de línea concretos. Durante el pilotaje se observó que los prediagnósticos generados bajo habilidades estructuradas tendían a conservar una organización común compuesta por: (a) identificación de fortalezas observadas, (b) señalamiento de inconsistencias algorítmicas con cita textual de código y (c) formulación de preguntas orientadoras para la corrección autónoma. Esta observación procede del pilotaje exploratorio y debe leerse como evidencia descriptiva: no se acompañó de un recuento sistemático de entregas, prediagnósticos generados ni revisiones docentes.</w:t>
+        <w:t xml:space="preserve"> y generando borradores de devolución que citaban números de línea concretos. Como verificación técnica exploratoria del comportamiento del sistema durante el pilotaje de los artefactos, los prediagnósticos generados bajo habilidades estructuradas mostraron, a nivel descriptivo, una pauta de organización compuesta por: (a) identificación de fortalezas técnicas, (b) señalamiento de inconsistencias algorítmicas con cita textual de código y (c) formulación de preguntas orientadoras para la corrección autónoma. Esta regularidad estructural procede de observaciones técnicas exploratorias y debe leerse como evidencia descriptiva del formato de salida del modelo: no se acompañó de un recuento sistemático de entregas, prediagnósticos generados ni revisiones docentes, constituyendo una característica sujeta a posterior validación empírica.</w:t>
       </w:r>
     </w:p>
     <w:p>
@@ -1734,7 +1734,7 @@
           <w:rFonts w:ascii="Times New Roman" w:hAnsi="Times New Roman"/>
           <w:sz w:val="24"/>
         </w:rPr>
-        <w:t xml:space="preserve">Durante las pruebas de pilotaje curricular en </w:t>
+        <w:t xml:space="preserve">A nivel de verificación técnica exploratoria durante el pilotaje de los artefactos en </w:t>
       </w:r>
       <w:r>
         <w:rPr>
@@ -1764,7 +1764,7 @@
           <w:rFonts w:ascii="Times New Roman" w:hAnsi="Times New Roman"/>
           <w:sz w:val="24"/>
         </w:rPr>
-        <w:t xml:space="preserve">, se observó una mayor consistencia aparente en la estructura de los borradores de evaluación cuando el agente operó subordinado a archivos </w:t>
+        <w:t xml:space="preserve">, la subordinación del agente a archivos </w:t>
       </w:r>
       <w:r>
         <w:rPr>
@@ -1779,7 +1779,7 @@
           <w:rFonts w:ascii="Times New Roman" w:hAnsi="Times New Roman"/>
           <w:sz w:val="24"/>
         </w:rPr>
-        <w:t xml:space="preserve"> y rúbricas analíticas formalizadas.</w:t>
+        <w:t xml:space="preserve"> y rúbricas analíticas formalizadas sugirió preliminarmente una mayor regularidad en la estructura de los borradores de prediagnóstico.</w:t>
       </w:r>
     </w:p>
     <w:p>
@@ -1791,7 +1791,7 @@
           <w:rFonts w:ascii="Times New Roman" w:hAnsi="Times New Roman"/>
           <w:sz w:val="24"/>
         </w:rPr>
-        <w:t xml:space="preserve">La exigencia protocolizada de vincular cada dictamen a evidencias localizables en el código facilitó la detección docente de afirmaciones erróneas y estableció condiciones operativas orientadas a reducir el riesgo de aceptar evaluaciones no verificadas. Al limitar las herramientas del agente a la inspección pericial mediante MCP, se restringió operativamente la generación directa de soluciones completas y se orientó la respuesta hacia observaciones diagnósticas y preguntas de andamiaje. No obstante, esta consistencia observada requiere ser validada en investigaciones futuras mediante coeficientes estandarizados de concordancia interjueces y diseños cuasiexperimentales controlados. Esta cautela es consistente con las revisiones sobre rúbricas analíticas, que asocian criterios explícitos y descriptores de desempeño con una mayor consistencia de las puntuaciones sin que ello garantice por sí solo la validez de la evaluación (Jonsson &amp; Svingby, 2007); en este trabajo, la formalización de criterios en </w:t>
+        <w:t xml:space="preserve">Desde la perspectiva del diseño sociotécnico, la exigencia protocolizada de vincular cada dictamen a evidencias localizables en el código se concibió como un mecanismo para favorecer la trazabilidad y la detección de eventuales afirmaciones erróneas durante la revisión humana, estableciendo condiciones operativas orientadas a reducir el riesgo de aceptar evaluaciones no verificadas. Al limitar las herramientas del agente a la inspección pericial mediante MCP, se restringió operativamente la generación directa de soluciones completas y se orientó la respuesta hacia observaciones diagnósticas y preguntas de andamiaje. No obstante, esta regularidad observada requiere ser validada en investigaciones futuras mediante coeficientes estandarizados de concordancia interjueces y diseños cuasiexperimentales controlados. Esta cautela es consistente con las revisiones sobre rúbricas analíticas, que asocian criterios explícitos y descriptores de desempeño con una mayor consistencia de las puntuaciones sin que ello garantice por sí solo la validez de la evaluación (Jonsson &amp; Svingby, 2007); en este trabajo, la formalización de criterios en </w:t>
       </w:r>
       <w:r>
         <w:rPr>
@@ -1806,7 +1806,7 @@
           <w:rFonts w:ascii="Times New Roman" w:hAnsi="Times New Roman"/>
           <w:sz w:val="24"/>
         </w:rPr>
-        <w:t xml:space="preserve"> constituye una condición plausible, pero no demostrada, de la consistencia aparente observada.</w:t>
+        <w:t xml:space="preserve"> constituye una condición plausible, pero no demostrada, de la regularidad aparente observada.</w:t>
       </w:r>
     </w:p>
     <w:p>
@@ -1833,7 +1833,7 @@
           <w:rFonts w:ascii="Times New Roman" w:hAnsi="Times New Roman"/>
           <w:sz w:val="24"/>
         </w:rPr>
-        <w:t>La experiencia respalda el uso de los agentes como asistentes de diagnóstico preliminar, manteniendo la decisión evaluativa final bajo responsabilidad docente. La generación de prediagnósticos orientados a la localización y el cotejo de patrones de código podría reducir parte del trabajo rutinario de revisión. No obstante, esta posibilidad no fue evaluada mediante un protocolo temporal controlado y deberá analizarse en estudios posteriores. Este rol de supervisión coincide con la evidencia de que la eficacia de la retroalimentación depende de su especificidad, su vínculo con la tarea y su orientación hacia la acción (Hattie &amp; Timperley, 2007), atributos que la revisión docente permite verificar antes de comunicarla, y con las advertencias sobre inexactitudes y variabilidad de los modelos generativos en la educación en computación (Denny et al., 2024; Lau &amp; Guo, 2023).</w:t>
+        <w:t>El marco conceptual y las verificaciones funcionales realizadas sustentan la hipótesis de diseño de emplear a los agentes exclusivamente como asistentes de diagnóstico preliminar, manteniendo la decisión evaluativa final bajo responsabilidad docente. La generación de prediagnósticos orientados a la localización y el cotejo de patrones de código podría reducir parte del trabajo rutinario de revisión. No obstante, esta posibilidad no fue evaluada mediante un protocolo temporal controlado y deberá analizarse en estudios posteriores. Este rol de supervisión coincide con la evidencia de que la eficacia de la retroalimentación depende de su especificidad, su vínculo con la tarea y su orientación hacia la acción (Hattie &amp; Timperley, 2007), atributos que la revisión docente permite verificar antes de comunicarla, y con las advertencias sobre inexactitudes y variabilidad de los modelos generativos en la educación en computación (Denny et al., 2024; Lau &amp; Guo, 2023).</w:t>
       </w:r>
     </w:p>
     <w:p>
@@ -1934,14 +1934,14 @@
           <w:b/>
           <w:sz w:val="24"/>
         </w:rPr>
-        <w:t>Evidencia exploratoria del pilotaje curricular:</w:t>
-      </w:r>
-      <w:r>
-        <w:rPr>
-          <w:rFonts w:ascii="Times New Roman" w:hAnsi="Times New Roman"/>
-          <w:sz w:val="24"/>
-        </w:rPr>
-        <w:t xml:space="preserve"> La observación sobre la estructura común de los prediagnósticos procede de un pilotaje descriptivo que no registró de manera sistemática la cantidad de entregas analizadas, de borradores generados, de docentes revisores, de afirmaciones erróneas detectadas ni la proporción de borradores aceptados o modificados; en consecuencia, no permite inferir calidad pedagógica, exactitud ni causalidad.</w:t>
+        <w:t>Carácter exploratorio de las observaciones del comportamiento del sistema:</w:t>
+      </w:r>
+      <w:r>
+        <w:rPr>
+          <w:rFonts w:ascii="Times New Roman" w:hAnsi="Times New Roman"/>
+          <w:sz w:val="24"/>
+        </w:rPr>
+        <w:t xml:space="preserve"> Las apreciaciones sobre la regularidad estructural de las salidas generadas proceden de verificaciones técnicas exploratorias que no registraron de manera sistemática la cantidad de entregas analizadas, de borradores generados, de docentes revisores, de afirmaciones erróneas detectadas ni la proporción de borradores aceptados o modificados; en consecuencia, no permiten inferir calidad pedagógica, exactitud ni causalidad.</w:t>
       </w:r>
     </w:p>
     <w:p>

</xml_diff>

<commit_message>
Corregir maquetacion de Figura 1: mantener unidos numero, titulo, imagen y nota en pagina siguiente
</commit_message>
<xml_diff>
--- a/publicacion/manuscrito_difusiones/articulo_tecnico_sin_participantes.docx
+++ b/publicacion/manuscrito_difusiones/articulo_tecnico_sin_participantes.docx
@@ -33,6 +33,7 @@
     <w:p>
       <w:pPr>
         <w:pStyle w:val="Heading2"/>
+        <w:keepNext/>
         <w:spacing w:before="200" w:after="80"/>
         <w:jc w:val="left"/>
       </w:pPr>
@@ -140,6 +141,7 @@
     <w:p>
       <w:pPr>
         <w:pStyle w:val="Heading2"/>
+        <w:keepNext/>
         <w:spacing w:before="200" w:after="80"/>
         <w:jc w:val="left"/>
       </w:pPr>
@@ -217,6 +219,7 @@
     <w:p>
       <w:pPr>
         <w:pStyle w:val="Heading1"/>
+        <w:keepNext/>
         <w:spacing w:before="280" w:after="120"/>
         <w:jc w:val="center"/>
       </w:pPr>
@@ -475,6 +478,7 @@
     <w:p>
       <w:pPr>
         <w:pStyle w:val="Heading1"/>
+        <w:keepNext/>
         <w:spacing w:before="280" w:after="120"/>
         <w:jc w:val="center"/>
       </w:pPr>
@@ -490,6 +494,7 @@
     <w:p>
       <w:pPr>
         <w:pStyle w:val="Heading2"/>
+        <w:keepNext/>
         <w:spacing w:before="200" w:after="80"/>
         <w:jc w:val="left"/>
       </w:pPr>
@@ -586,6 +591,7 @@
     <w:p>
       <w:pPr>
         <w:pStyle w:val="Heading2"/>
+        <w:keepNext/>
         <w:spacing w:before="200" w:after="80"/>
         <w:jc w:val="left"/>
       </w:pPr>
@@ -754,6 +760,7 @@
     <w:p>
       <w:pPr>
         <w:pStyle w:val="Heading2"/>
+        <w:keepNext/>
         <w:spacing w:before="200" w:after="80"/>
         <w:jc w:val="left"/>
       </w:pPr>
@@ -780,6 +787,8 @@
     </w:p>
     <w:p>
       <w:pPr>
+        <w:keepNext/>
+        <w:pageBreakBefore/>
         <w:spacing w:line="240" w:lineRule="auto" w:before="240" w:after="40"/>
       </w:pPr>
       <w:r>
@@ -793,6 +802,7 @@
     </w:p>
     <w:p>
       <w:pPr>
+        <w:keepNext/>
         <w:spacing w:line="240" w:lineRule="auto" w:before="0" w:after="120"/>
       </w:pPr>
       <w:r>
@@ -806,13 +816,14 @@
     </w:p>
     <w:p>
       <w:pPr>
-        <w:spacing w:before="120" w:after="120"/>
+        <w:keepNext/>
+        <w:spacing w:before="80" w:after="80"/>
         <w:jc w:val="center"/>
       </w:pPr>
       <w:r>
         <w:drawing>
           <wp:inline xmlns:a="http://schemas.openxmlformats.org/drawingml/2006/main" xmlns:pic="http://schemas.openxmlformats.org/drawingml/2006/picture">
-            <wp:extent cx="5472000" cy="3830400"/>
+            <wp:extent cx="5040000" cy="3528000"/>
             <wp:docPr id="1" name="Picture 1" title="Figura 1. Arquitectura sociotécnica MCP y supervisión docente activa" descr="Diagrama de la arquitectura sociotécnica de evaluación continua asistida por agentes, organizada en tres capas: gobernanza contextual, interoperabilidad mediante MCP y supervisión docente."/>
             <wp:cNvGraphicFramePr>
               <a:graphicFrameLocks noChangeAspect="1"/>
@@ -833,7 +844,7 @@
                   <pic:spPr>
                     <a:xfrm>
                       <a:off x="0" y="0"/>
-                      <a:ext cx="5472000" cy="3830400"/>
+                      <a:ext cx="5040000" cy="3528000"/>
                     </a:xfrm>
                     <a:prstGeom prst="rect"/>
                   </pic:spPr>
@@ -1200,6 +1211,7 @@
     <w:p>
       <w:pPr>
         <w:pStyle w:val="Heading2"/>
+        <w:keepNext/>
         <w:spacing w:before="200" w:after="80"/>
         <w:jc w:val="left"/>
       </w:pPr>
@@ -1356,6 +1368,7 @@
     <w:p>
       <w:pPr>
         <w:pStyle w:val="Heading2"/>
+        <w:keepNext/>
         <w:spacing w:before="200" w:after="80"/>
         <w:jc w:val="left"/>
       </w:pPr>
@@ -1383,6 +1396,7 @@
     <w:p>
       <w:pPr>
         <w:pStyle w:val="Heading1"/>
+        <w:keepNext/>
         <w:spacing w:before="280" w:after="120"/>
         <w:jc w:val="center"/>
       </w:pPr>
@@ -1398,6 +1412,7 @@
     <w:p>
       <w:pPr>
         <w:pStyle w:val="Heading2"/>
+        <w:keepNext/>
         <w:spacing w:before="200" w:after="80"/>
         <w:jc w:val="left"/>
       </w:pPr>
@@ -1479,6 +1494,7 @@
     <w:p>
       <w:pPr>
         <w:pStyle w:val="Heading2"/>
+        <w:keepNext/>
         <w:spacing w:before="200" w:after="80"/>
         <w:jc w:val="left"/>
       </w:pPr>
@@ -1581,6 +1597,7 @@
     <w:p>
       <w:pPr>
         <w:pStyle w:val="Heading2"/>
+        <w:keepNext/>
         <w:spacing w:before="200" w:after="80"/>
         <w:jc w:val="left"/>
       </w:pPr>
@@ -1656,6 +1673,7 @@
     <w:p>
       <w:pPr>
         <w:pStyle w:val="Heading2"/>
+        <w:keepNext/>
         <w:spacing w:before="200" w:after="80"/>
         <w:jc w:val="left"/>
       </w:pPr>
@@ -1698,6 +1716,7 @@
     <w:p>
       <w:pPr>
         <w:pStyle w:val="Heading1"/>
+        <w:keepNext/>
         <w:spacing w:before="280" w:after="120"/>
         <w:jc w:val="center"/>
       </w:pPr>
@@ -1713,6 +1732,7 @@
     <w:p>
       <w:pPr>
         <w:pStyle w:val="Heading2"/>
+        <w:keepNext/>
         <w:spacing w:before="200" w:after="80"/>
         <w:jc w:val="left"/>
       </w:pPr>
@@ -1812,6 +1832,7 @@
     <w:p>
       <w:pPr>
         <w:pStyle w:val="Heading2"/>
+        <w:keepNext/>
         <w:spacing w:before="200" w:after="80"/>
         <w:jc w:val="left"/>
       </w:pPr>
@@ -1851,6 +1872,7 @@
     <w:p>
       <w:pPr>
         <w:pStyle w:val="Heading2"/>
+        <w:keepNext/>
         <w:spacing w:before="200" w:after="80"/>
         <w:jc w:val="left"/>
       </w:pPr>
@@ -1878,6 +1900,7 @@
     <w:p>
       <w:pPr>
         <w:pStyle w:val="Heading2"/>
+        <w:keepNext/>
         <w:spacing w:before="200" w:after="80"/>
         <w:jc w:val="left"/>
       </w:pPr>
@@ -2055,6 +2078,7 @@
     <w:p>
       <w:pPr>
         <w:pStyle w:val="Heading1"/>
+        <w:keepNext/>
         <w:spacing w:before="280" w:after="120"/>
         <w:jc w:val="center"/>
       </w:pPr>
@@ -2280,6 +2304,7 @@
     <w:p>
       <w:pPr>
         <w:pStyle w:val="Heading1"/>
+        <w:keepNext/>
         <w:spacing w:before="280" w:after="120"/>
         <w:jc w:val="center"/>
       </w:pPr>
@@ -2295,6 +2320,7 @@
     <w:p>
       <w:pPr>
         <w:pStyle w:val="Heading2"/>
+        <w:keepNext/>
         <w:spacing w:before="200" w:after="80"/>
         <w:jc w:val="left"/>
       </w:pPr>
@@ -2322,6 +2348,7 @@
     <w:p>
       <w:pPr>
         <w:pStyle w:val="Heading2"/>
+        <w:keepNext/>
         <w:spacing w:before="200" w:after="80"/>
         <w:jc w:val="left"/>
       </w:pPr>
@@ -2349,6 +2376,7 @@
     <w:p>
       <w:pPr>
         <w:pStyle w:val="Heading2"/>
+        <w:keepNext/>
         <w:spacing w:before="200" w:after="80"/>
         <w:jc w:val="left"/>
       </w:pPr>
@@ -2376,6 +2404,7 @@
     <w:p>
       <w:pPr>
         <w:pStyle w:val="Heading1"/>
+        <w:keepNext/>
         <w:spacing w:before="280" w:after="120"/>
         <w:jc w:val="center"/>
       </w:pPr>

</xml_diff>